<commit_message>
docs(HCO v2): ROM policy fixes
</commit_message>
<xml_diff>
--- a/policies/build/chapters_v2/ROM/HCO_ROM_2_v2_REWRITE_DRAFT.docx
+++ b/policies/build/chapters_v2/ROM/HCO_ROM_2_v2_REWRITE_DRAFT.docx
@@ -1679,6 +1679,26 @@
     </w:p>
     <w:p>
       <w:pPr>
+        <w:pStyle w:val="ListBullet"/>
+      </w:pPr>
+      <w:r>
+        <w:t xml:space="preserve">National Medical Commission (adopting the Indian Medical Council). (2002). </w:t>
+      </w:r>
+      <w:hyperlink r:id="rId9">
+        <w:r>
+          <w:rPr>
+            <w:color w:val="0563C1"/>
+            <w:u w:val="single"/>
+          </w:rPr>
+          <w:t>https://www.nmc.org.in/wp-content/uploads/2017/10/Ethics-Regulations-2002.pdf</w:t>
+        </w:r>
+      </w:hyperlink>
+      <w:r>
+        <w:t xml:space="preserve"> Code of Medical Ethics — Professional Conduct, Etiquette and Ethics Regulations — the recognised minimum reference named in ROM.2's own ethical management framework requirement.</w:t>
+      </w:r>
+    </w:p>
+    <w:p>
+      <w:pPr>
         <w:pBdr>
           <w:bottom w:val="single" w:sz="6" w:space="1" w:color="auto"/>
         </w:pBdr>

</xml_diff>